<commit_message>
Corrige negrito quebrado, resíduos de trabalho em grupo e honestidade dos tempos-baseline
- material do participante (JFCE e TJCE): asteriscos crus que apareciam como
  texto em três pontos (roteiros E1-E3, colunas da ficha do projeto, semáforo
  de sigilo) viram negrito de verdade
- TJCE: EX4.1 deixa de falar em "a sala escolhe / justifiquem / digam"; caderno
  do instrutor perde o último "job aid"
- caderno do instrutor (JFCE): três notas de condução deixam de supor grupo
- casos-tipo: nova seção "Sobre os tempos deste anexo" — os tempos são
  referência calibrada, não medição de vara real, e há instrução de substituição
- tabela "Os links da turma": chave data-k duplicada corrigida, cinco endereços

Co-Authored-By: Claude Opus 4.8 (1M context) <noreply@anthropic.com>
Claude-Session: https://claude.ai/code/session_017L3yDjVrwyFFQVUsfndpCA
</commit_message>
<xml_diff>
--- a/tjce/Casos-tipo-Projeto-Integrador-TJCE.docx
+++ b/tjce/Casos-tipo-Projeto-Integrador-TJCE.docx
@@ -2,7 +2,7 @@
 <file path=word/document.xml><?xml version="1.0" encoding="utf-8"?>
 <w:document xmlns:w="http://schemas.openxmlformats.org/wordprocessingml/2006/main" xmlns:m="http://schemas.openxmlformats.org/officeDocument/2006/math" xmlns:r="http://schemas.openxmlformats.org/officeDocument/2006/relationships" xmlns:o="urn:schemas-microsoft-com:office:office" xmlns:v="urn:schemas-microsoft-com:vml" xmlns:w10="urn:schemas-microsoft-com:office:word" xmlns:a="http://schemas.openxmlformats.org/drawingml/2006/main" xmlns:pic="http://schemas.openxmlformats.org/drawingml/2006/picture" xmlns:wp="http://schemas.openxmlformats.org/drawingml/2006/wordprocessingDrawing">
   <w:body>
-    <w:bookmarkStart w:id="28" w:name="X1dd4bac4197a954fb496d5e99b5afe422048e16"/>
+    <w:bookmarkStart w:id="29" w:name="X1dd4bac4197a954fb496d5e99b5afe422048e16"/>
     <w:p>
       <w:pPr>
         <w:pStyle w:val="Heading1"/>
@@ -167,7 +167,19 @@
         <w:rPr>
           <w:rFonts w:ascii="Calibri" w:hAnsi="Calibri"/>
         </w:rPr>
-        <w:t xml:space="preserve">fictício de Vara Cível que já vem com a rotina descrita e o tempo médio por unidade medido. Isso</w:t>
+        <w:t xml:space="preserve">fictício de Vara Cível que já vem com a rotina descrita e um tempo médio por unidade de</w:t>
+      </w:r>
+      <w:r>
+        <w:rPr>
+          <w:rFonts w:ascii="Calibri" w:hAnsi="Calibri"/>
+        </w:rPr>
+        <w:t xml:space="preserve"> </w:t>
+      </w:r>
+      <w:r>
+        <w:rPr>
+          <w:rFonts w:ascii="Calibri" w:hAnsi="Calibri"/>
+        </w:rPr>
+        <w:t xml:space="preserve">referência. Isso</w:t>
       </w:r>
       <w:r>
         <w:rPr>
@@ -381,7 +393,7 @@
         <w:rPr>
           <w:rFonts w:ascii="Calibri" w:hAnsi="Calibri"/>
         </w:rPr>
-        <w:t xml:space="preserve">são plausíveis e servem de baseline; não são estatística de vara real.</w:t>
+        <w:t xml:space="preserve">são referências calibradas para o exercício, não estatística de vara real (veja o aviso abaixo).</w:t>
       </w:r>
     </w:p>
     <w:p>
@@ -506,7 +518,306 @@
       </w:r>
     </w:p>
     <w:bookmarkEnd w:id="20"/>
-    <w:bookmarkStart w:id="21" w:name="quadro-comparativo"/>
+    <w:bookmarkStart w:id="21" w:name="sobre-os-tempos-deste-anexo"/>
+    <w:p>
+      <w:pPr>
+        <w:pStyle w:val="Heading2"/>
+      </w:pPr>
+      <w:r>
+        <w:rPr>
+          <w:rFonts w:ascii="Calibri" w:hAnsi="Calibri"/>
+        </w:rPr>
+        <w:t xml:space="preserve">Sobre os tempos deste anexo</w:t>
+      </w:r>
+    </w:p>
+    <w:p>
+      <w:pPr>
+        <w:pStyle w:val="FirstParagraph"/>
+      </w:pPr>
+      <w:r>
+        <w:rPr>
+          <w:rFonts w:ascii="Calibri" w:hAnsi="Calibri"/>
+        </w:rPr>
+        <w:t xml:space="preserve">Os valores da coluna</w:t>
+      </w:r>
+      <w:r>
+        <w:rPr>
+          <w:rFonts w:ascii="Calibri" w:hAnsi="Calibri"/>
+        </w:rPr>
+        <w:t xml:space="preserve"> </w:t>
+      </w:r>
+      <w:r>
+        <w:rPr>
+          <w:rFonts w:ascii="Calibri" w:hAnsi="Calibri"/>
+        </w:rPr>
+        <w:t xml:space="preserve">“</w:t>
+      </w:r>
+      <w:r>
+        <w:rPr>
+          <w:rFonts w:ascii="Calibri" w:hAnsi="Calibri"/>
+        </w:rPr>
+        <w:t xml:space="preserve">tempo médio hoje</w:t>
+      </w:r>
+      <w:r>
+        <w:rPr>
+          <w:rFonts w:ascii="Calibri" w:hAnsi="Calibri"/>
+        </w:rPr>
+        <w:t xml:space="preserve">”</w:t>
+      </w:r>
+      <w:r>
+        <w:rPr>
+          <w:rFonts w:ascii="Calibri" w:hAnsi="Calibri"/>
+        </w:rPr>
+        <w:t xml:space="preserve"> </w:t>
+      </w:r>
+      <w:r>
+        <w:rPr>
+          <w:rFonts w:ascii="Calibri" w:hAnsi="Calibri"/>
+        </w:rPr>
+        <w:t xml:space="preserve">são</w:t>
+      </w:r>
+      <w:r>
+        <w:rPr>
+          <w:rFonts w:ascii="Calibri" w:hAnsi="Calibri"/>
+        </w:rPr>
+        <w:t xml:space="preserve"> </w:t>
+      </w:r>
+      <w:r>
+        <w:rPr>
+          <w:rFonts w:ascii="Calibri" w:hAnsi="Calibri"/>
+          <w:b/>
+          <w:bCs/>
+        </w:rPr>
+        <w:t xml:space="preserve">referências plausíveis, calibradas para o</w:t>
+      </w:r>
+      <w:r>
+        <w:rPr>
+          <w:rFonts w:ascii="Calibri" w:hAnsi="Calibri"/>
+          <w:b/>
+          <w:bCs/>
+        </w:rPr>
+        <w:t xml:space="preserve"> </w:t>
+      </w:r>
+      <w:r>
+        <w:rPr>
+          <w:rFonts w:ascii="Calibri" w:hAnsi="Calibri"/>
+          <w:b/>
+          <w:bCs/>
+        </w:rPr>
+        <w:t xml:space="preserve">exercício — não são medição de vara estadual real</w:t>
+      </w:r>
+      <w:r>
+        <w:rPr>
+          <w:rFonts w:ascii="Calibri" w:hAnsi="Calibri"/>
+        </w:rPr>
+        <w:t xml:space="preserve">. Existem para que todo participante comece o</w:t>
+      </w:r>
+      <w:r>
+        <w:rPr>
+          <w:rFonts w:ascii="Calibri" w:hAnsi="Calibri"/>
+        </w:rPr>
+        <w:t xml:space="preserve"> </w:t>
+      </w:r>
+      <w:r>
+        <w:rPr>
+          <w:rFonts w:ascii="Calibri" w:hAnsi="Calibri"/>
+        </w:rPr>
+        <w:t xml:space="preserve">projeto com um</w:t>
+      </w:r>
+      <w:r>
+        <w:rPr>
+          <w:rFonts w:ascii="Calibri" w:hAnsi="Calibri"/>
+        </w:rPr>
+        <w:t xml:space="preserve"> </w:t>
+      </w:r>
+      <w:r>
+        <w:rPr>
+          <w:rFonts w:ascii="Calibri" w:hAnsi="Calibri"/>
+        </w:rPr>
+        <w:t xml:space="preserve">“</w:t>
+      </w:r>
+      <w:r>
+        <w:rPr>
+          <w:rFonts w:ascii="Calibri" w:hAnsi="Calibri"/>
+        </w:rPr>
+        <w:t xml:space="preserve">antes</w:t>
+      </w:r>
+      <w:r>
+        <w:rPr>
+          <w:rFonts w:ascii="Calibri" w:hAnsi="Calibri"/>
+        </w:rPr>
+        <w:t xml:space="preserve">”</w:t>
+      </w:r>
+      <w:r>
+        <w:rPr>
+          <w:rFonts w:ascii="Calibri" w:hAnsi="Calibri"/>
+        </w:rPr>
+        <w:t xml:space="preserve"> </w:t>
+      </w:r>
+      <w:r>
+        <w:rPr>
+          <w:rFonts w:ascii="Calibri" w:hAnsi="Calibri"/>
+        </w:rPr>
+        <w:t xml:space="preserve">registrado, que é o que torna o</w:t>
+      </w:r>
+      <w:r>
+        <w:rPr>
+          <w:rFonts w:ascii="Calibri" w:hAnsi="Calibri"/>
+        </w:rPr>
+        <w:t xml:space="preserve"> </w:t>
+      </w:r>
+      <w:r>
+        <w:rPr>
+          <w:rFonts w:ascii="Calibri" w:hAnsi="Calibri"/>
+        </w:rPr>
+        <w:t xml:space="preserve">“</w:t>
+      </w:r>
+      <w:r>
+        <w:rPr>
+          <w:rFonts w:ascii="Calibri" w:hAnsi="Calibri"/>
+        </w:rPr>
+        <w:t xml:space="preserve">depois</w:t>
+      </w:r>
+      <w:r>
+        <w:rPr>
+          <w:rFonts w:ascii="Calibri" w:hAnsi="Calibri"/>
+        </w:rPr>
+        <w:t xml:space="preserve">”</w:t>
+      </w:r>
+      <w:r>
+        <w:rPr>
+          <w:rFonts w:ascii="Calibri" w:hAnsi="Calibri"/>
+        </w:rPr>
+        <w:t xml:space="preserve"> </w:t>
+      </w:r>
+      <w:r>
+        <w:rPr>
+          <w:rFonts w:ascii="Calibri" w:hAnsi="Calibri"/>
+        </w:rPr>
+        <w:t xml:space="preserve">comparável.</w:t>
+      </w:r>
+    </w:p>
+    <w:p>
+      <w:pPr>
+        <w:pStyle w:val="BodyText"/>
+      </w:pPr>
+      <w:r>
+        <w:rPr>
+          <w:rFonts w:ascii="Calibri" w:hAnsi="Calibri"/>
+          <w:b/>
+          <w:bCs/>
+        </w:rPr>
+        <w:t xml:space="preserve">Se a unidade tiver o número real da rotina</w:t>
+      </w:r>
+      <w:r>
+        <w:rPr>
+          <w:rFonts w:ascii="Calibri" w:hAnsi="Calibri"/>
+        </w:rPr>
+        <w:t xml:space="preserve">, o instrutor pode substituí-lo: é</w:t>
+      </w:r>
+      <w:r>
+        <w:rPr>
+          <w:rFonts w:ascii="Calibri" w:hAnsi="Calibri"/>
+        </w:rPr>
+        <w:t xml:space="preserve"> </w:t>
+      </w:r>
+      <w:r>
+        <w:rPr>
+          <w:rFonts w:ascii="Calibri" w:hAnsi="Calibri"/>
+          <w:b/>
+          <w:bCs/>
+        </w:rPr>
+        <w:t xml:space="preserve">uma linha por</w:t>
+      </w:r>
+      <w:r>
+        <w:rPr>
+          <w:rFonts w:ascii="Calibri" w:hAnsi="Calibri"/>
+          <w:b/>
+          <w:bCs/>
+        </w:rPr>
+        <w:t xml:space="preserve"> </w:t>
+      </w:r>
+      <w:r>
+        <w:rPr>
+          <w:rFonts w:ascii="Calibri" w:hAnsi="Calibri"/>
+          <w:b/>
+          <w:bCs/>
+        </w:rPr>
+        <w:t xml:space="preserve">caso</w:t>
+      </w:r>
+      <w:r>
+        <w:rPr>
+          <w:rFonts w:ascii="Calibri" w:hAnsi="Calibri"/>
+        </w:rPr>
+        <w:t xml:space="preserve"> </w:t>
+      </w:r>
+      <w:r>
+        <w:rPr>
+          <w:rFonts w:ascii="Calibri" w:hAnsi="Calibri"/>
+        </w:rPr>
+        <w:t xml:space="preserve">(</w:t>
+      </w:r>
+      <w:r>
+        <w:rPr>
+          <w:rFonts w:ascii="Calibri" w:hAnsi="Calibri"/>
+        </w:rPr>
+        <w:t xml:space="preserve">“</w:t>
+      </w:r>
+      <w:r>
+        <w:rPr>
+          <w:rFonts w:ascii="Calibri" w:hAnsi="Calibri"/>
+        </w:rPr>
+        <w:t xml:space="preserve">Tempo médio por unidade hoje</w:t>
+      </w:r>
+      <w:r>
+        <w:rPr>
+          <w:rFonts w:ascii="Calibri" w:hAnsi="Calibri"/>
+        </w:rPr>
+        <w:t xml:space="preserve">”</w:t>
+      </w:r>
+      <w:r>
+        <w:rPr>
+          <w:rFonts w:ascii="Calibri" w:hAnsi="Calibri"/>
+        </w:rPr>
+        <w:t xml:space="preserve">), e todo o resto do anexo — rotina, insumos, armadilhas e</w:t>
+      </w:r>
+      <w:r>
+        <w:rPr>
+          <w:rFonts w:ascii="Calibri" w:hAnsi="Calibri"/>
+        </w:rPr>
+        <w:t xml:space="preserve"> </w:t>
+      </w:r>
+      <w:r>
+        <w:rPr>
+          <w:rFonts w:ascii="Calibri" w:hAnsi="Calibri"/>
+        </w:rPr>
+        <w:t xml:space="preserve">ficha — continua valendo sem alteração. Quando isso for feito, convém dizer à turma que aquele</w:t>
+      </w:r>
+      <w:r>
+        <w:rPr>
+          <w:rFonts w:ascii="Calibri" w:hAnsi="Calibri"/>
+        </w:rPr>
+        <w:t xml:space="preserve"> </w:t>
+      </w:r>
+      <w:r>
+        <w:rPr>
+          <w:rFonts w:ascii="Calibri" w:hAnsi="Calibri"/>
+        </w:rPr>
+        <w:t xml:space="preserve">número passou a ser real, porque muda o peso do resultado apresentado no Encontro 4.</w:t>
+      </w:r>
+    </w:p>
+    <w:p>
+      <w:r>
+        <w:rPr>
+          <w:rFonts w:ascii="Calibri" w:hAnsi="Calibri"/>
+        </w:rPr>
+        <w:pict>
+          <v:rect style="width:0;height:1.5pt" o:hralign="center" o:hrstd="t" o:hr="t"/>
+        </w:pict>
+      </w:r>
+    </w:p>
+    <w:bookmarkEnd w:id="21"/>
+    <w:bookmarkStart w:id="22" w:name="quadro-comparativo"/>
     <w:p>
       <w:pPr>
         <w:pStyle w:val="Heading2"/>
@@ -679,7 +990,7 @@
                 <w:color w:val="FFFFFF"/>
                 <w:sz w:val="22"/>
               </w:rPr>
-              <w:t xml:space="preserve">Tempo médio hoje</w:t>
+              <w:t xml:space="preserve">Tempo médio hoje (referência)</w:t>
             </w:r>
           </w:p>
         </w:tc>
@@ -1253,8 +1564,8 @@
         </w:pict>
       </w:r>
     </w:p>
-    <w:bookmarkEnd w:id="21"/>
-    <w:bookmarkStart w:id="22" w:name="caso-tipo-a-triagem-de-petições-iniciais"/>
+    <w:bookmarkEnd w:id="22"/>
+    <w:bookmarkStart w:id="23" w:name="caso-tipo-a-triagem-de-petições-iniciais"/>
     <w:p>
       <w:pPr>
         <w:pStyle w:val="Heading2"/>
@@ -2356,8 +2667,8 @@
         </w:pict>
       </w:r>
     </w:p>
-    <w:bookmarkEnd w:id="22"/>
-    <w:bookmarkStart w:id="23" w:name="Xa5dd2c69ba78fc6845f4388c1a31d9f8c516d15"/>
+    <w:bookmarkEnd w:id="23"/>
+    <w:bookmarkStart w:id="24" w:name="Xa5dd2c69ba78fc6845f4388c1a31d9f8c516d15"/>
     <w:p>
       <w:pPr>
         <w:pStyle w:val="Heading2"/>
@@ -2850,8 +3161,8 @@
         </w:pict>
       </w:r>
     </w:p>
-    <w:bookmarkEnd w:id="23"/>
-    <w:bookmarkStart w:id="24" w:name="caso-tipo-c-minutas-padrão-de-expediente"/>
+    <w:bookmarkEnd w:id="24"/>
+    <w:bookmarkStart w:id="25" w:name="caso-tipo-c-minutas-padrão-de-expediente"/>
     <w:p>
       <w:pPr>
         <w:pStyle w:val="Heading2"/>
@@ -3438,8 +3749,8 @@
         </w:pict>
       </w:r>
     </w:p>
-    <w:bookmarkEnd w:id="24"/>
-    <w:bookmarkStart w:id="25" w:name="X48c8ca90790a75ed41cbd914435d5686e586df6"/>
+    <w:bookmarkEnd w:id="25"/>
+    <w:bookmarkStart w:id="26" w:name="X48c8ca90790a75ed41cbd914435d5686e586df6"/>
     <w:p>
       <w:pPr>
         <w:pStyle w:val="Heading2"/>
@@ -3929,8 +4240,8 @@
         </w:pict>
       </w:r>
     </w:p>
-    <w:bookmarkEnd w:id="25"/>
-    <w:bookmarkStart w:id="26" w:name="X9c94d5e3f5eeb9416f6cb0b0ddcf4df80c97124"/>
+    <w:bookmarkEnd w:id="26"/>
+    <w:bookmarkStart w:id="27" w:name="X9c94d5e3f5eeb9416f6cb0b0ddcf4df80c97124"/>
     <w:p>
       <w:pPr>
         <w:pStyle w:val="Heading2"/>
@@ -4411,8 +4722,8 @@
         </w:pict>
       </w:r>
     </w:p>
-    <w:bookmarkEnd w:id="26"/>
-    <w:bookmarkStart w:id="27" w:name="nota-de-sigilo"/>
+    <w:bookmarkEnd w:id="27"/>
+    <w:bookmarkStart w:id="28" w:name="nota-de-sigilo"/>
     <w:p>
       <w:pPr>
         <w:pStyle w:val="Heading2"/>
@@ -4563,8 +4874,8 @@
         <w:t xml:space="preserve">sentido quando o envio já é permitido (Resolução CNJ 615/2025, arts. 7º e 19).</w:t>
       </w:r>
     </w:p>
-    <w:bookmarkEnd w:id="27"/>
     <w:bookmarkEnd w:id="28"/>
+    <w:bookmarkEnd w:id="29"/>
     <w:sectPr>
       <w:headerReference r:id="rId9" w:type="default"/>
       <w:footerReference r:id="rId10" w:type="default"/>

</xml_diff>